<commit_message>
Weekly internship search: 2026-09-02
- One-time scope migration: sports-media -> sports-tech (renamed files,
  rebalanced resume/cover letter to lead with Gameday Stats and drop
  video/photo-editing emphasis, retagged 3 existing listings, 0 removed)
- Expired 1 listing past its deadline (Castleton Commodities)
- Backfilled stable listing_id on all pre-existing entries for applied-tracking
- Added 6 new listings: Green Bay Packers, Judi Health, Workiva, Oculi,
  Protiviti, DraftKings (sports-tech/development/database tracks)
- Tailored development, database, and sports-tech resumes/cover letters
  for this run's Tier B/C matches
- Republished the board artifact with a live Applied-tracking section
  wired to the db capability, plus the sports-tech rename throughout

Co-Authored-By: Claude Sonnet 5 <noreply@anthropic.com>
Claude-Session: https://claude.ai/code/session_016sjtB8T1mXKYgpjQifs3rW
</commit_message>
<xml_diff>
--- a/resumes/development.docx
+++ b/resumes/development.docx
@@ -320,7 +320,7 @@
           <w:sz w:val="21"/>
           <w:szCs w:val="21"/>
         </w:rPr>
-        <w:t xml:space="preserve">Owning a database-backed tool end-to-end, from schema design through query logic, that lets users selectively pull statistics for individual games, players, and teams. Implementing SQL-driven backend query logic in Python to eliminate manual data-gathering for end users. Stack: Python, SQL.</w:t>
+        <w:t xml:space="preserve">Owning a database-backed tool end-to-end, from requirements through schema design and query logic, that lets users selectively pull statistics for individual games, players, and teams. Implementing and testing SQL-driven backend query logic in Python to eliminate manual data-gathering for end users. Stack: Python, SQL.</w:t>
       </w:r>
     </w:p>
     <w:p>
@@ -351,7 +351,7 @@
           <w:sz w:val="21"/>
           <w:szCs w:val="21"/>
         </w:rPr>
-        <w:t xml:space="preserve">Built a file-processing script that scans an input folder, parses MacOS "locked" metadata, duplicates matching files, strips the metadata, and moves copies into a target folder.</w:t>
+        <w:t xml:space="preserve">Built a file-processing script that scans an input folder, parses MacOS "locked" metadata on camera image files, duplicates matching files, strips the metadata, and moves copies into a target folder.</w:t>
       </w:r>
     </w:p>
     <w:p>

</xml_diff>